<commit_message>
Fix (1) multierror | generacion de docx
</commit_message>
<xml_diff>
--- a/participantes-app/public/S-140_plantilla.docx
+++ b/participantes-app/public/S-140_plantilla.docx
@@ -46,7 +46,7 @@
               <w:rPr>
                 <w:b/>
               </w:rPr>
-              <w:t>{{congregacion}}</w:t>
+              <w:t>{$congregacion$}</w:t>
             </w:r>
           </w:p>
         </w:tc>
@@ -142,7 +142,7 @@
                 <w:b/>
                 <w:lang w:val="es-MX"/>
               </w:rPr>
-              <w:t>{{s1_fecha}}</w:t>
+              <w:t>{$s1_fecha$}</w:t>
             </w:r>
           </w:p>
         </w:tc>
@@ -192,7 +192,7 @@
               <w:spacing w:after="0" w:line="240" w:lineRule="auto"/>
             </w:pPr>
             <w:r>
-              <w:t xml:space="preserve">{{s1_presidente}}</w:t>
+              <w:t xml:space="preserve">{$s1_presidente$}</w:t>
             </w:r>
           </w:p>
         </w:tc>
@@ -279,7 +279,7 @@
               <w:t xml:space="preserve">Canción </w:t>
             </w:r>
             <w:r>
-              <w:t xml:space="preserve">{{s1_can_ap}}</w:t>
+              <w:t xml:space="preserve">{$s1_can_ap$}</w:t>
             </w:r>
           </w:p>
         </w:tc>
@@ -331,7 +331,7 @@
               <w:spacing w:after="0" w:line="240" w:lineRule="auto"/>
             </w:pPr>
             <w:r>
-              <w:t xml:space="preserve">{{s1_oracion_ap}}</w:t>
+              <w:t xml:space="preserve">{$s1_oracion_ap$}</w:t>
             </w:r>
           </w:p>
         </w:tc>
@@ -574,7 +574,7 @@
               <w:spacing w:after="0" w:line="240" w:lineRule="auto"/>
             </w:pPr>
             <w:r>
-              <w:t>1. {{s1_tb_titulo}}</w:t>
+              <w:t>1. {$s1_tb_titulo$}</w:t>
             </w:r>
             <w:r>
               <w:rPr>
@@ -646,7 +646,7 @@
               <w:spacing w:after="0" w:line="240" w:lineRule="auto"/>
             </w:pPr>
             <w:r>
-              <w:t xml:space="preserve">{{s1_tb_cond}}</w:t>
+              <w:t xml:space="preserve">{$s1_tb_cond$}</w:t>
             </w:r>
           </w:p>
         </w:tc>
@@ -787,7 +787,7 @@
               <w:spacing w:after="0" w:line="240" w:lineRule="auto"/>
             </w:pPr>
             <w:r>
-              <w:t xml:space="preserve">{{s1_pe_cond}}</w:t>
+              <w:t xml:space="preserve">{$s1_pe_cond$}</w:t>
             </w:r>
           </w:p>
         </w:tc>
@@ -928,7 +928,7 @@
               <w:spacing w:after="0" w:line="240" w:lineRule="auto"/>
             </w:pPr>
             <w:r>
-              <w:t xml:space="preserve">{{s1_lb_est}}</w:t>
+              <w:t xml:space="preserve">{$s1_lb_est$}</w:t>
             </w:r>
           </w:p>
         </w:tc>
@@ -1090,7 +1090,7 @@
               </w:rPr>
             </w:pPr>
             <w:r>
-              <w:t>4. {{s1_smt1_titulo}}</w:t>
+              <w:t>4. {$s1_smt1_titulo$}</w:t>
             </w:r>
             <w:r>
               <w:rPr>
@@ -1189,7 +1189,7 @@
               <w:spacing w:after="0" w:line="240" w:lineRule="auto"/>
             </w:pPr>
             <w:r>
-              <w:t xml:space="preserve">{{s1_smt1_est}}/{{s1_smt1_ayu}}</w:t>
+              <w:t xml:space="preserve">{$s1_smt1_est$}/{$s1_smt1_ayu$}</w:t>
             </w:r>
           </w:p>
         </w:tc>
@@ -1245,7 +1245,7 @@
               </w:rPr>
             </w:pPr>
             <w:r>
-              <w:t>5. {{s1_smt2_titulo}}</w:t>
+              <w:t>5. {$s1_smt2_titulo$}</w:t>
             </w:r>
             <w:r>
               <w:rPr>
@@ -1343,7 +1343,7 @@
               <w:spacing w:after="0" w:line="240" w:lineRule="auto"/>
             </w:pPr>
             <w:r>
-              <w:t xml:space="preserve">{{s1_smt2_est}}/{{s1_smt2_ayu}}</w:t>
+              <w:t xml:space="preserve">{$s1_smt2_est$}/{$s1_smt2_ayu$}</w:t>
             </w:r>
           </w:p>
         </w:tc>
@@ -1399,7 +1399,7 @@
               </w:rPr>
             </w:pPr>
             <w:r>
-              <w:t>6. {{s1_smt3_titulo}}</w:t>
+              <w:t>6. {$s1_smt3_titulo$}</w:t>
             </w:r>
             <w:r>
               <w:rPr>
@@ -1497,7 +1497,7 @@
               <w:spacing w:after="0" w:line="240" w:lineRule="auto"/>
             </w:pPr>
             <w:r>
-              <w:t xml:space="preserve">{{s1_smt3_est}}/{{s1_smt3_ayu}}</w:t>
+              <w:t xml:space="preserve">{$s1_smt3_est$}/{$s1_smt3_ayu$}</w:t>
             </w:r>
           </w:p>
         </w:tc>
@@ -1555,7 +1555,7 @@
               </w:rPr>
             </w:pPr>
             <w:r>
-              <w:t>7. {{s1_smt4_titulo}}</w:t>
+              <w:t>7. {$s1_smt4_titulo$}</w:t>
             </w:r>
             <w:r>
               <w:rPr>
@@ -1649,7 +1649,7 @@
               <w:spacing w:after="0" w:line="240" w:lineRule="auto"/>
             </w:pPr>
             <w:r>
-              <w:t xml:space="preserve">{{s1_smt4_est}}/{{s1_smt4_ayu}}</w:t>
+              <w:t xml:space="preserve">{$s1_smt4_est$}/{$s1_smt4_ayu$}</w:t>
             </w:r>
           </w:p>
         </w:tc>
@@ -1784,7 +1784,7 @@
               <w:t xml:space="preserve">Canción </w:t>
             </w:r>
             <w:r>
-              <w:t xml:space="preserve">{{s1_can_vc}}</w:t>
+              <w:t xml:space="preserve">{$s1_can_vc$}</w:t>
             </w:r>
           </w:p>
         </w:tc>
@@ -1859,7 +1859,7 @@
               <w:spacing w:after="0" w:line="240" w:lineRule="auto"/>
             </w:pPr>
             <w:r>
-              <w:t>8. {{s1_vc1_titulo}}</w:t>
+              <w:t>8. {$s1_vc1_titulo$}</w:t>
             </w:r>
             <w:r>
               <w:t> </w:t>
@@ -1927,7 +1927,7 @@
               <w:spacing w:after="0" w:line="240" w:lineRule="auto"/>
             </w:pPr>
             <w:r>
-              <w:t xml:space="preserve">{{s1_vc1_cond}}</w:t>
+              <w:t xml:space="preserve">{$s1_vc1_cond$}</w:t>
             </w:r>
           </w:p>
         </w:tc>
@@ -1979,7 +1979,7 @@
               <w:spacing w:after="0" w:line="240" w:lineRule="auto"/>
             </w:pPr>
             <w:r>
-              <w:t>9. {{s1_vc2_titulo}}</w:t>
+              <w:t>9. {$s1_vc2_titulo$}</w:t>
             </w:r>
             <w:r>
               <w:t> </w:t>
@@ -2047,7 +2047,7 @@
               <w:spacing w:after="0" w:line="240" w:lineRule="auto"/>
             </w:pPr>
             <w:r>
-              <w:t xml:space="preserve">{{s1_vc2_cond}}</w:t>
+              <w:t xml:space="preserve">{$s1_vc2_cond$}</w:t>
             </w:r>
           </w:p>
         </w:tc>
@@ -2205,7 +2205,7 @@
               <w:spacing w:after="0" w:line="240" w:lineRule="auto"/>
             </w:pPr>
             <w:r>
-              <w:t xml:space="preserve">{{s1_ebc_cond}}/{{s1_ebc_lect}}</w:t>
+              <w:t xml:space="preserve">{$s1_ebc_cond$}/{$s1_ebc_lect$}</w:t>
             </w:r>
           </w:p>
         </w:tc>
@@ -2373,7 +2373,7 @@
               <w:t xml:space="preserve">Canción </w:t>
             </w:r>
             <w:r>
-              <w:t xml:space="preserve">{{s1_can_ci}}</w:t>
+              <w:t xml:space="preserve">{$s1_can_ci$}</w:t>
             </w:r>
           </w:p>
         </w:tc>
@@ -2424,7 +2424,7 @@
               <w:spacing w:after="0" w:line="240" w:lineRule="auto"/>
             </w:pPr>
             <w:r>
-              <w:t xml:space="preserve">{{s1_oracion_ci}}</w:t>
+              <w:t xml:space="preserve">{$s1_oracion_ci$}</w:t>
             </w:r>
           </w:p>
         </w:tc>
@@ -2503,7 +2503,7 @@
                 <w:b/>
                 <w:lang w:val="es-MX"/>
               </w:rPr>
-              <w:t>{{s2_fecha}}</w:t>
+              <w:t>{$s2_fecha$}</w:t>
             </w:r>
           </w:p>
         </w:tc>
@@ -2553,7 +2553,7 @@
               <w:spacing w:after="0" w:line="240" w:lineRule="auto"/>
             </w:pPr>
             <w:r>
-              <w:t xml:space="preserve">{{s2_vc1_cond}}</w:t>
+              <w:t xml:space="preserve">{$s2_vc1_cond$}</w:t>
             </w:r>
           </w:p>
         </w:tc>
@@ -2639,7 +2639,7 @@
               <w:t xml:space="preserve">Canción </w:t>
             </w:r>
             <w:r>
-              <w:t xml:space="preserve">{{s2_can_ap}}</w:t>
+              <w:t xml:space="preserve">{$s2_can_ap$}</w:t>
             </w:r>
           </w:p>
         </w:tc>
@@ -2691,7 +2691,7 @@
               <w:spacing w:after="0" w:line="240" w:lineRule="auto"/>
             </w:pPr>
             <w:r>
-              <w:t xml:space="preserve">{{s2_vc2_cond}}</w:t>
+              <w:t xml:space="preserve">{$s2_vc2_cond$}</w:t>
             </w:r>
           </w:p>
         </w:tc>
@@ -2941,7 +2941,7 @@
               <w:spacing w:after="0" w:line="240" w:lineRule="auto"/>
             </w:pPr>
             <w:r>
-              <w:t>1. {{s2_tb_titulo}}</w:t>
+              <w:t>1. {$s2_tb_titulo$}</w:t>
             </w:r>
             <w:r>
               <w:rPr>
@@ -2994,7 +2994,7 @@
               <w:spacing w:after="0" w:line="240" w:lineRule="auto"/>
             </w:pPr>
             <w:r>
-              <w:t xml:space="preserve">{{s2_oracion_ci}}</w:t>
+              <w:t xml:space="preserve">{$s2_oracion_ci$}</w:t>
             </w:r>
           </w:p>
         </w:tc>
@@ -3116,7 +3116,7 @@
               <w:spacing w:after="0" w:line="240" w:lineRule="auto"/>
             </w:pPr>
             <w:r>
-              <w:t xml:space="preserve">{{s3_vc1_cond}}</w:t>
+              <w:t xml:space="preserve">{$s3_vc1_cond$}</w:t>
             </w:r>
           </w:p>
         </w:tc>
@@ -3278,7 +3278,7 @@
               <w:spacing w:after="0" w:line="240" w:lineRule="auto"/>
             </w:pPr>
             <w:r>
-              <w:t xml:space="preserve">{{s3_vc2_cond}}</w:t>
+              <w:t xml:space="preserve">{$s3_vc2_cond$}</w:t>
             </w:r>
           </w:p>
         </w:tc>
@@ -3440,7 +3440,7 @@
               </w:rPr>
             </w:pPr>
             <w:r>
-              <w:t>4. {{s2_smt1_titulo}}</w:t>
+              <w:t>4. {$s2_smt1_titulo$}</w:t>
             </w:r>
             <w:r>
               <w:rPr>
@@ -3539,7 +3539,7 @@
               <w:spacing w:after="0" w:line="240" w:lineRule="auto"/>
             </w:pPr>
             <w:r>
-              <w:t xml:space="preserve">{{s2_smt1_est}}/{{s2_smt1_ayu}}</w:t>
+              <w:t xml:space="preserve">{$s2_smt1_est$}/{$s2_smt1_ayu$}</w:t>
             </w:r>
           </w:p>
         </w:tc>
@@ -3595,7 +3595,7 @@
               </w:rPr>
             </w:pPr>
             <w:r>
-              <w:t>5. {{s2_smt2_titulo}}</w:t>
+              <w:t>5. {$s2_smt2_titulo$}</w:t>
             </w:r>
             <w:r>
               <w:rPr>
@@ -3693,7 +3693,7 @@
               <w:spacing w:after="0" w:line="240" w:lineRule="auto"/>
             </w:pPr>
             <w:r>
-              <w:t xml:space="preserve">{{s2_smt2_est}}/{{s2_smt2_ayu}}</w:t>
+              <w:t xml:space="preserve">{$s2_smt2_est$}/{$s2_smt2_ayu$}</w:t>
             </w:r>
           </w:p>
         </w:tc>
@@ -3749,7 +3749,7 @@
               </w:rPr>
             </w:pPr>
             <w:r>
-              <w:t>6. {{s2_smt3_titulo}}</w:t>
+              <w:t>6. {$s2_smt3_titulo$}</w:t>
             </w:r>
             <w:r>
               <w:rPr>
@@ -3847,7 +3847,7 @@
               <w:spacing w:after="0" w:line="240" w:lineRule="auto"/>
             </w:pPr>
             <w:r>
-              <w:t xml:space="preserve">{{s2_smt3_est}}/{{s2_smt3_ayu}}</w:t>
+              <w:t xml:space="preserve">{$s2_smt3_est$}/{$s2_smt3_ayu$}</w:t>
             </w:r>
           </w:p>
         </w:tc>
@@ -3905,7 +3905,7 @@
               </w:rPr>
             </w:pPr>
             <w:r>
-              <w:t>7. {{s2_smt4_titulo}}</w:t>
+              <w:t>7. {$s2_smt4_titulo$}</w:t>
             </w:r>
             <w:r>
               <w:rPr>
@@ -3999,7 +3999,7 @@
               <w:spacing w:after="0" w:line="240" w:lineRule="auto"/>
             </w:pPr>
             <w:r>
-              <w:t xml:space="preserve">{{s2_smt4_est}}/{{s2_smt4_ayu}}</w:t>
+              <w:t xml:space="preserve">{$s2_smt4_est$}/{$s2_smt4_ayu$}</w:t>
             </w:r>
           </w:p>
         </w:tc>
@@ -4134,7 +4134,7 @@
               <w:t xml:space="preserve">Canción </w:t>
             </w:r>
             <w:r>
-              <w:t xml:space="preserve">{{s2_can_vc}}</w:t>
+              <w:t xml:space="preserve">{$s2_can_vc$}</w:t>
             </w:r>
           </w:p>
         </w:tc>
@@ -4209,7 +4209,7 @@
               <w:spacing w:after="0" w:line="240" w:lineRule="auto"/>
             </w:pPr>
             <w:r>
-              <w:t>8. {{s2_vc1_titulo}}</w:t>
+              <w:t>8. {$s2_vc1_titulo$}</w:t>
             </w:r>
             <w:r>
               <w:t> </w:t>
@@ -4277,7 +4277,7 @@
               <w:spacing w:after="0" w:line="240" w:lineRule="auto"/>
             </w:pPr>
             <w:r>
-              <w:t xml:space="preserve">{{s3_oracion_ci}}</w:t>
+              <w:t xml:space="preserve">{$s3_oracion_ci$}</w:t>
             </w:r>
           </w:p>
         </w:tc>
@@ -4329,7 +4329,7 @@
               <w:spacing w:after="0" w:line="240" w:lineRule="auto"/>
             </w:pPr>
             <w:r>
-              <w:t>9. {{s2_vc2_titulo}}</w:t>
+              <w:t>9. {$s2_vc2_titulo$}</w:t>
             </w:r>
             <w:r>
               <w:t> </w:t>
@@ -4397,7 +4397,7 @@
               <w:spacing w:after="0" w:line="240" w:lineRule="auto"/>
             </w:pPr>
             <w:r>
-              <w:t xml:space="preserve">{{s4_presidente}}</w:t>
+              <w:t xml:space="preserve">{$s4_presidente$}</w:t>
             </w:r>
           </w:p>
         </w:tc>
@@ -4555,7 +4555,7 @@
               <w:spacing w:after="0" w:line="240" w:lineRule="auto"/>
             </w:pPr>
             <w:r>
-              <w:t xml:space="preserve">{{s2_ebc_cond}}/{{s2_ebc_lect}}</w:t>
+              <w:t xml:space="preserve">{$s2_ebc_cond$}/{$s2_ebc_lect$}</w:t>
             </w:r>
           </w:p>
         </w:tc>
@@ -4737,7 +4737,7 @@
               <w:t xml:space="preserve">Canción </w:t>
             </w:r>
             <w:r>
-              <w:t xml:space="preserve">{{s2_can_ci}}</w:t>
+              <w:t xml:space="preserve">{$s2_can_ci$}</w:t>
             </w:r>
           </w:p>
         </w:tc>
@@ -4788,7 +4788,7 @@
               <w:spacing w:after="0" w:line="240" w:lineRule="auto"/>
             </w:pPr>
             <w:r>
-              <w:t xml:space="preserve">{{s4_oracion_ap}}</w:t>
+              <w:t xml:space="preserve">{$s4_oracion_ap$}</w:t>
             </w:r>
           </w:p>
         </w:tc>
@@ -4870,7 +4870,7 @@
                 <w:b/>
               </w:rPr>
               <w:lastRenderedPageBreak/>
-              <w:t>{{congregacion}}</w:t>
+              <w:t>{$congregacion$}</w:t>
             </w:r>
           </w:p>
         </w:tc>
@@ -4966,7 +4966,7 @@
                 <w:b/>
                 <w:lang w:val="es-MX"/>
               </w:rPr>
-              <w:t>{{s3_fecha}}</w:t>
+              <w:t>{$s3_fecha$}</w:t>
             </w:r>
           </w:p>
         </w:tc>
@@ -5016,7 +5016,7 @@
               <w:spacing w:after="0" w:line="240" w:lineRule="auto"/>
             </w:pPr>
             <w:r>
-              <w:t xml:space="preserve">{{s2_presidente}}</w:t>
+              <w:t xml:space="preserve">{$s2_presidente$}</w:t>
             </w:r>
           </w:p>
         </w:tc>
@@ -5103,7 +5103,7 @@
               <w:t xml:space="preserve">Canción </w:t>
             </w:r>
             <w:r>
-              <w:t xml:space="preserve">{{s3_can_ap}}</w:t>
+              <w:t xml:space="preserve">{$s3_can_ap$}</w:t>
             </w:r>
           </w:p>
         </w:tc>
@@ -5155,7 +5155,7 @@
               <w:spacing w:after="0" w:line="240" w:lineRule="auto"/>
             </w:pPr>
             <w:r>
-              <w:t xml:space="preserve">{{s2_oracion_ap}}</w:t>
+              <w:t xml:space="preserve">{$s2_oracion_ap$}</w:t>
             </w:r>
           </w:p>
         </w:tc>
@@ -5398,7 +5398,7 @@
               <w:spacing w:after="0" w:line="240" w:lineRule="auto"/>
             </w:pPr>
             <w:r>
-              <w:t>1. {{s3_tb_titulo}}</w:t>
+              <w:t>1. {$s3_tb_titulo$}</w:t>
             </w:r>
             <w:r>
               <w:rPr>
@@ -5470,7 +5470,7 @@
               <w:spacing w:after="0" w:line="240" w:lineRule="auto"/>
             </w:pPr>
             <w:r>
-              <w:t xml:space="preserve">{{s2_tb_cond}}</w:t>
+              <w:t xml:space="preserve">{$s2_tb_cond$}</w:t>
             </w:r>
           </w:p>
         </w:tc>
@@ -5611,7 +5611,7 @@
               <w:spacing w:after="0" w:line="240" w:lineRule="auto"/>
             </w:pPr>
             <w:r>
-              <w:t xml:space="preserve">{{s2_pe_cond}}</w:t>
+              <w:t xml:space="preserve">{$s2_pe_cond$}</w:t>
             </w:r>
           </w:p>
         </w:tc>
@@ -5752,7 +5752,7 @@
               <w:spacing w:after="0" w:line="240" w:lineRule="auto"/>
             </w:pPr>
             <w:r>
-              <w:t xml:space="preserve">{{s2_lb_est}}</w:t>
+              <w:t xml:space="preserve">{$s2_lb_est$}</w:t>
             </w:r>
           </w:p>
         </w:tc>
@@ -5914,7 +5914,7 @@
               </w:rPr>
             </w:pPr>
             <w:r>
-              <w:t>4. {{s3_smt1_titulo}}</w:t>
+              <w:t>4. {$s3_smt1_titulo$}</w:t>
             </w:r>
             <w:r>
               <w:rPr>
@@ -6013,7 +6013,7 @@
               <w:spacing w:after="0" w:line="240" w:lineRule="auto"/>
             </w:pPr>
             <w:r>
-              <w:t xml:space="preserve">{{s3_smt1_est}}/{{s3_smt1_ayu}}</w:t>
+              <w:t xml:space="preserve">{$s3_smt1_est$}/{$s3_smt1_ayu$}</w:t>
             </w:r>
           </w:p>
         </w:tc>
@@ -6069,7 +6069,7 @@
               </w:rPr>
             </w:pPr>
             <w:r>
-              <w:t>5. {{s3_smt2_titulo}}</w:t>
+              <w:t>5. {$s3_smt2_titulo$}</w:t>
             </w:r>
             <w:r>
               <w:rPr>
@@ -6167,7 +6167,7 @@
               <w:spacing w:after="0" w:line="240" w:lineRule="auto"/>
             </w:pPr>
             <w:r>
-              <w:t xml:space="preserve">{{s3_smt2_est}}/{{s3_smt2_ayu}}</w:t>
+              <w:t xml:space="preserve">{$s3_smt2_est$}/{$s3_smt2_ayu$}</w:t>
             </w:r>
           </w:p>
         </w:tc>
@@ -6223,7 +6223,7 @@
               </w:rPr>
             </w:pPr>
             <w:r>
-              <w:t>6. {{s3_smt3_titulo}}</w:t>
+              <w:t>6. {$s3_smt3_titulo$}</w:t>
             </w:r>
             <w:r>
               <w:rPr>
@@ -6321,7 +6321,7 @@
               <w:spacing w:after="0" w:line="240" w:lineRule="auto"/>
             </w:pPr>
             <w:r>
-              <w:t xml:space="preserve">{{s3_smt3_est}}/{{s3_smt3_ayu}}</w:t>
+              <w:t xml:space="preserve">{$s3_smt3_est$}/{$s3_smt3_ayu$}</w:t>
             </w:r>
           </w:p>
         </w:tc>
@@ -6379,7 +6379,7 @@
               </w:rPr>
             </w:pPr>
             <w:r>
-              <w:t>7. {{s3_smt4_titulo}}</w:t>
+              <w:t>7. {$s3_smt4_titulo$}</w:t>
             </w:r>
             <w:r>
               <w:rPr>
@@ -6473,7 +6473,7 @@
               <w:spacing w:after="0" w:line="240" w:lineRule="auto"/>
             </w:pPr>
             <w:r>
-              <w:t xml:space="preserve">{{s3_smt4_est}}/{{s3_smt4_ayu}}</w:t>
+              <w:t xml:space="preserve">{$s3_smt4_est$}/{$s3_smt4_ayu$}</w:t>
             </w:r>
           </w:p>
         </w:tc>
@@ -6608,7 +6608,7 @@
               <w:t xml:space="preserve">Canción </w:t>
             </w:r>
             <w:r>
-              <w:t xml:space="preserve">{{s3_can_vc}}</w:t>
+              <w:t xml:space="preserve">{$s3_can_vc$}</w:t>
             </w:r>
           </w:p>
         </w:tc>
@@ -6683,7 +6683,7 @@
               <w:spacing w:after="0" w:line="240" w:lineRule="auto"/>
             </w:pPr>
             <w:r>
-              <w:t>8. {{s3_vc1_titulo}}</w:t>
+              <w:t>8. {$s3_vc1_titulo$}</w:t>
             </w:r>
             <w:r>
               <w:t> </w:t>
@@ -6751,7 +6751,7 @@
               <w:spacing w:after="0" w:line="240" w:lineRule="auto"/>
             </w:pPr>
             <w:r>
-              <w:t xml:space="preserve">{{s4_tb_cond}}</w:t>
+              <w:t xml:space="preserve">{$s4_tb_cond$}</w:t>
             </w:r>
           </w:p>
         </w:tc>
@@ -6803,7 +6803,7 @@
               <w:spacing w:after="0" w:line="240" w:lineRule="auto"/>
             </w:pPr>
             <w:r>
-              <w:t>9. {{s3_vc2_titulo}}</w:t>
+              <w:t>9. {$s3_vc2_titulo$}</w:t>
             </w:r>
             <w:r>
               <w:t> </w:t>
@@ -6871,7 +6871,7 @@
               <w:spacing w:after="0" w:line="240" w:lineRule="auto"/>
             </w:pPr>
             <w:r>
-              <w:t xml:space="preserve">{{s4_pe_cond}}</w:t>
+              <w:t xml:space="preserve">{$s4_pe_cond$}</w:t>
             </w:r>
           </w:p>
         </w:tc>
@@ -7023,7 +7023,7 @@
               <w:spacing w:after="0" w:line="240" w:lineRule="auto"/>
             </w:pPr>
             <w:r>
-              <w:t xml:space="preserve">{{s3_ebc_cond}}/{{s3_ebc_lect}}</w:t>
+              <w:t xml:space="preserve">{$s3_ebc_cond$}/{$s3_ebc_lect$}</w:t>
             </w:r>
           </w:p>
         </w:tc>
@@ -7191,7 +7191,7 @@
               <w:t xml:space="preserve">Canción </w:t>
             </w:r>
             <w:r>
-              <w:t xml:space="preserve">{{s3_can_ci}}</w:t>
+              <w:t xml:space="preserve">{$s3_can_ci$}</w:t>
             </w:r>
           </w:p>
         </w:tc>
@@ -7242,7 +7242,7 @@
               <w:spacing w:after="0" w:line="240" w:lineRule="auto"/>
             </w:pPr>
             <w:r>
-              <w:t xml:space="preserve">{{s4_lb_est}}</w:t>
+              <w:t xml:space="preserve">{$s4_lb_est$}</w:t>
             </w:r>
           </w:p>
         </w:tc>
@@ -7321,7 +7321,7 @@
                 <w:b/>
                 <w:lang w:val="es-MX"/>
               </w:rPr>
-              <w:t>{{s4_fecha}}</w:t>
+              <w:t>{$s4_fecha$}</w:t>
             </w:r>
           </w:p>
         </w:tc>
@@ -7371,7 +7371,7 @@
               <w:spacing w:after="0" w:line="240" w:lineRule="auto"/>
             </w:pPr>
             <w:r>
-              <w:t xml:space="preserve">{{s4_vc1_cond}}</w:t>
+              <w:t xml:space="preserve">{$s4_vc1_cond$}</w:t>
             </w:r>
           </w:p>
         </w:tc>
@@ -7457,7 +7457,7 @@
               <w:t xml:space="preserve">Canción </w:t>
             </w:r>
             <w:r>
-              <w:t xml:space="preserve">{{s4_can_ap}}</w:t>
+              <w:t xml:space="preserve">{$s4_can_ap$}</w:t>
             </w:r>
           </w:p>
         </w:tc>
@@ -7509,7 +7509,7 @@
               <w:spacing w:after="0" w:line="240" w:lineRule="auto"/>
             </w:pPr>
             <w:r>
-              <w:t xml:space="preserve">{{s4_vc2_cond}}</w:t>
+              <w:t xml:space="preserve">{$s4_vc2_cond$}</w:t>
             </w:r>
           </w:p>
         </w:tc>
@@ -7759,7 +7759,7 @@
               <w:spacing w:after="0" w:line="240" w:lineRule="auto"/>
             </w:pPr>
             <w:r>
-              <w:t>1. {{s4_tb_titulo}}</w:t>
+              <w:t>1. {$s4_tb_titulo$}</w:t>
             </w:r>
             <w:r>
               <w:rPr>
@@ -7812,7 +7812,7 @@
               <w:spacing w:after="0" w:line="240" w:lineRule="auto"/>
             </w:pPr>
             <w:r>
-              <w:t xml:space="preserve">{{s4_oracion_ci}}</w:t>
+              <w:t xml:space="preserve">{$s4_oracion_ci$}</w:t>
             </w:r>
           </w:p>
         </w:tc>
@@ -7934,7 +7934,7 @@
               <w:spacing w:after="0" w:line="240" w:lineRule="auto"/>
             </w:pPr>
             <w:r>
-              <w:t xml:space="preserve">{{s5_presidente}}</w:t>
+              <w:t xml:space="preserve">{$s5_presidente$}</w:t>
             </w:r>
           </w:p>
         </w:tc>
@@ -8090,7 +8090,7 @@
               <w:spacing w:after="0" w:line="240" w:lineRule="auto"/>
             </w:pPr>
             <w:r>
-              <w:t xml:space="preserve">{{s5_oracion_ap}}</w:t>
+              <w:t xml:space="preserve">{$s5_oracion_ap$}</w:t>
             </w:r>
           </w:p>
         </w:tc>
@@ -8252,7 +8252,7 @@
               </w:rPr>
             </w:pPr>
             <w:r>
-              <w:t>4. {{s4_smt1_titulo}}</w:t>
+              <w:t>4. {$s4_smt1_titulo$}</w:t>
             </w:r>
             <w:r>
               <w:rPr>
@@ -8351,7 +8351,7 @@
               <w:spacing w:after="0" w:line="240" w:lineRule="auto"/>
             </w:pPr>
             <w:r>
-              <w:t xml:space="preserve">{{s4_smt1_est}}/{{s4_smt1_ayu}}</w:t>
+              <w:t xml:space="preserve">{$s4_smt1_est$}/{$s4_smt1_ayu$}</w:t>
             </w:r>
           </w:p>
         </w:tc>
@@ -8407,7 +8407,7 @@
               </w:rPr>
             </w:pPr>
             <w:r>
-              <w:t>5. {{s4_smt2_titulo}}</w:t>
+              <w:t>5. {$s4_smt2_titulo$}</w:t>
             </w:r>
             <w:r>
               <w:rPr>
@@ -8505,7 +8505,7 @@
               <w:spacing w:after="0" w:line="240" w:lineRule="auto"/>
             </w:pPr>
             <w:r>
-              <w:t xml:space="preserve">{{s4_smt2_est}}/{{s4_smt2_ayu}}</w:t>
+              <w:t xml:space="preserve">{$s4_smt2_est$}/{$s4_smt2_ayu$}</w:t>
             </w:r>
           </w:p>
         </w:tc>
@@ -8561,7 +8561,7 @@
               </w:rPr>
             </w:pPr>
             <w:r>
-              <w:t>6. {{s4_smt3_titulo}}</w:t>
+              <w:t>6. {$s4_smt3_titulo$}</w:t>
             </w:r>
             <w:r>
               <w:rPr>
@@ -8659,7 +8659,7 @@
               <w:spacing w:after="0" w:line="240" w:lineRule="auto"/>
             </w:pPr>
             <w:r>
-              <w:t xml:space="preserve">{{s4_smt3_est}}/{{s4_smt3_ayu}}</w:t>
+              <w:t xml:space="preserve">{$s4_smt3_est$}/{$s4_smt3_ayu$}</w:t>
             </w:r>
           </w:p>
         </w:tc>
@@ -8717,7 +8717,7 @@
               </w:rPr>
             </w:pPr>
             <w:r>
-              <w:t>7. {{s4_smt4_titulo}}</w:t>
+              <w:t>7. {$s4_smt4_titulo$}</w:t>
             </w:r>
             <w:r>
               <w:rPr>
@@ -8811,7 +8811,7 @@
               <w:spacing w:after="0" w:line="240" w:lineRule="auto"/>
             </w:pPr>
             <w:r>
-              <w:t xml:space="preserve">{{s4_smt4_est}}/{{s4_smt4_ayu}}</w:t>
+              <w:t xml:space="preserve">{$s4_smt4_est$}/{$s4_smt4_ayu$}</w:t>
             </w:r>
           </w:p>
         </w:tc>
@@ -8946,7 +8946,7 @@
               <w:t xml:space="preserve">Canción </w:t>
             </w:r>
             <w:r>
-              <w:t xml:space="preserve">{{s4_can_vc}}</w:t>
+              <w:t xml:space="preserve">{$s4_can_vc$}</w:t>
             </w:r>
           </w:p>
         </w:tc>
@@ -9021,7 +9021,7 @@
               <w:spacing w:after="0" w:line="240" w:lineRule="auto"/>
             </w:pPr>
             <w:r>
-              <w:t>8. {{s4_vc1_titulo}}</w:t>
+              <w:t>8. {$s4_vc1_titulo$}</w:t>
             </w:r>
             <w:r>
               <w:t> </w:t>
@@ -9089,7 +9089,7 @@
               <w:spacing w:after="0" w:line="240" w:lineRule="auto"/>
             </w:pPr>
             <w:r>
-              <w:t xml:space="preserve">{{s5_tb_cond}}</w:t>
+              <w:t xml:space="preserve">{$s5_tb_cond$}</w:t>
             </w:r>
           </w:p>
         </w:tc>
@@ -9141,7 +9141,7 @@
               <w:spacing w:after="0" w:line="240" w:lineRule="auto"/>
             </w:pPr>
             <w:r>
-              <w:t>9. {{s4_vc2_titulo}}</w:t>
+              <w:t>9. {$s4_vc2_titulo$}</w:t>
             </w:r>
             <w:r>
               <w:t> </w:t>
@@ -9209,7 +9209,7 @@
               <w:spacing w:after="0" w:line="240" w:lineRule="auto"/>
             </w:pPr>
             <w:r>
-              <w:t xml:space="preserve">{{s5_pe_cond}}</w:t>
+              <w:t xml:space="preserve">{$s5_pe_cond$}</w:t>
             </w:r>
           </w:p>
         </w:tc>
@@ -9361,7 +9361,7 @@
               <w:spacing w:after="0" w:line="240" w:lineRule="auto"/>
             </w:pPr>
             <w:r>
-              <w:t xml:space="preserve">{{s4_ebc_cond}}/{{s4_ebc_lect}}</w:t>
+              <w:t xml:space="preserve">{$s4_ebc_cond$}/{$s4_ebc_lect$}</w:t>
             </w:r>
           </w:p>
         </w:tc>
@@ -9549,7 +9549,7 @@
               <w:t xml:space="preserve">Canción </w:t>
             </w:r>
             <w:r>
-              <w:t xml:space="preserve">{{s4_can_ci}}</w:t>
+              <w:t xml:space="preserve">{$s4_can_ci$}</w:t>
             </w:r>
           </w:p>
         </w:tc>
@@ -9606,7 +9606,7 @@
               <w:spacing w:after="0" w:line="240" w:lineRule="auto"/>
             </w:pPr>
             <w:r>
-              <w:t xml:space="preserve">{{s5_lb_est}}</w:t>
+              <w:t xml:space="preserve">{$s5_lb_est$}</w:t>
             </w:r>
           </w:p>
         </w:tc>
@@ -9666,7 +9666,7 @@
                 <w:b/>
               </w:rPr>
               <w:lastRenderedPageBreak/>
-              <w:t>{{congregacion}}</w:t>
+              <w:t>{$congregacion$}</w:t>
             </w:r>
           </w:p>
         </w:tc>
@@ -9763,7 +9763,7 @@
                 <w:b/>
                 <w:lang w:val="es-MX"/>
               </w:rPr>
-              <w:t>{{s5_fecha}}</w:t>
+              <w:t>{$s5_fecha$}</w:t>
             </w:r>
           </w:p>
         </w:tc>
@@ -9813,7 +9813,7 @@
               <w:spacing w:after="0" w:line="240" w:lineRule="auto"/>
             </w:pPr>
             <w:r>
-              <w:t xml:space="preserve">{{s3_presidente}}</w:t>
+              <w:t xml:space="preserve">{$s3_presidente$}</w:t>
             </w:r>
           </w:p>
         </w:tc>
@@ -9900,7 +9900,7 @@
               <w:t xml:space="preserve">Canción </w:t>
             </w:r>
             <w:r>
-              <w:t xml:space="preserve">{{s5_can_ap}}</w:t>
+              <w:t xml:space="preserve">{$s5_can_ap$}</w:t>
             </w:r>
           </w:p>
         </w:tc>
@@ -9952,7 +9952,7 @@
               <w:spacing w:after="0" w:line="240" w:lineRule="auto"/>
             </w:pPr>
             <w:r>
-              <w:t xml:space="preserve">{{s3_oracion_ap}}</w:t>
+              <w:t xml:space="preserve">{$s3_oracion_ap$}</w:t>
             </w:r>
           </w:p>
         </w:tc>
@@ -10195,7 +10195,7 @@
               <w:spacing w:after="0" w:line="240" w:lineRule="auto"/>
             </w:pPr>
             <w:r>
-              <w:t>1. {{s5_tb_titulo}}</w:t>
+              <w:t>1. {$s5_tb_titulo$}</w:t>
             </w:r>
             <w:r>
               <w:rPr>
@@ -10267,7 +10267,7 @@
               <w:spacing w:after="0" w:line="240" w:lineRule="auto"/>
             </w:pPr>
             <w:r>
-              <w:t xml:space="preserve">{{s3_tb_cond}}</w:t>
+              <w:t xml:space="preserve">{$s3_tb_cond$}</w:t>
             </w:r>
           </w:p>
         </w:tc>
@@ -10408,7 +10408,7 @@
               <w:spacing w:after="0" w:line="240" w:lineRule="auto"/>
             </w:pPr>
             <w:r>
-              <w:t xml:space="preserve">{{s3_pe_cond}}</w:t>
+              <w:t xml:space="preserve">{$s3_pe_cond$}</w:t>
             </w:r>
           </w:p>
         </w:tc>
@@ -10549,7 +10549,7 @@
               <w:spacing w:after="0" w:line="240" w:lineRule="auto"/>
             </w:pPr>
             <w:r>
-              <w:t xml:space="preserve">{{s3_lb_est}}</w:t>
+              <w:t xml:space="preserve">{$s3_lb_est$}</w:t>
             </w:r>
           </w:p>
         </w:tc>
@@ -10711,7 +10711,7 @@
               </w:rPr>
             </w:pPr>
             <w:r>
-              <w:t>4. {{s5_smt1_titulo}}</w:t>
+              <w:t>4. {$s5_smt1_titulo$}</w:t>
             </w:r>
             <w:r>
               <w:rPr>
@@ -10810,7 +10810,7 @@
               <w:spacing w:after="0" w:line="240" w:lineRule="auto"/>
             </w:pPr>
             <w:r>
-              <w:t xml:space="preserve">{{s5_smt1_est}}/{{s5_smt1_ayu}}</w:t>
+              <w:t xml:space="preserve">{$s5_smt1_est$}/{$s5_smt1_ayu$}</w:t>
             </w:r>
           </w:p>
         </w:tc>
@@ -10866,7 +10866,7 @@
               </w:rPr>
             </w:pPr>
             <w:r>
-              <w:t>5. {{s5_smt2_titulo}}</w:t>
+              <w:t>5. {$s5_smt2_titulo$}</w:t>
             </w:r>
             <w:r>
               <w:rPr>
@@ -10964,7 +10964,7 @@
               <w:spacing w:after="0" w:line="240" w:lineRule="auto"/>
             </w:pPr>
             <w:r>
-              <w:t xml:space="preserve">{{s5_smt2_est}}/{{s5_smt2_ayu}}</w:t>
+              <w:t xml:space="preserve">{$s5_smt2_est$}/{$s5_smt2_ayu$}</w:t>
             </w:r>
           </w:p>
         </w:tc>
@@ -11020,7 +11020,7 @@
               </w:rPr>
             </w:pPr>
             <w:r>
-              <w:t>6. {{s5_smt3_titulo}}</w:t>
+              <w:t>6. {$s5_smt3_titulo$}</w:t>
             </w:r>
             <w:r>
               <w:rPr>
@@ -11118,7 +11118,7 @@
               <w:spacing w:after="0" w:line="240" w:lineRule="auto"/>
             </w:pPr>
             <w:r>
-              <w:t xml:space="preserve">{{s5_smt3_est}}/{{s5_smt3_ayu}}</w:t>
+              <w:t xml:space="preserve">{$s5_smt3_est$}/{$s5_smt3_ayu$}</w:t>
             </w:r>
           </w:p>
         </w:tc>
@@ -11176,7 +11176,7 @@
               </w:rPr>
             </w:pPr>
             <w:r>
-              <w:t>7. {{s5_smt4_titulo}}</w:t>
+              <w:t>7. {$s5_smt4_titulo$}</w:t>
             </w:r>
             <w:r>
               <w:rPr>
@@ -11270,7 +11270,7 @@
               <w:spacing w:after="0" w:line="240" w:lineRule="auto"/>
             </w:pPr>
             <w:r>
-              <w:t xml:space="preserve">{{s5_smt4_est}}/{{s5_smt4_ayu}}</w:t>
+              <w:t xml:space="preserve">{$s5_smt4_est$}/{$s5_smt4_ayu$}</w:t>
             </w:r>
           </w:p>
         </w:tc>
@@ -11405,7 +11405,7 @@
               <w:t xml:space="preserve">Canción </w:t>
             </w:r>
             <w:r>
-              <w:t xml:space="preserve">{{s5_can_vc}}</w:t>
+              <w:t xml:space="preserve">{$s5_can_vc$}</w:t>
             </w:r>
           </w:p>
         </w:tc>
@@ -11480,7 +11480,7 @@
               <w:spacing w:after="0" w:line="240" w:lineRule="auto"/>
             </w:pPr>
             <w:r>
-              <w:t>8. {{s5_vc1_titulo}}</w:t>
+              <w:t>8. {$s5_vc1_titulo$}</w:t>
             </w:r>
             <w:r>
               <w:t> </w:t>
@@ -11548,7 +11548,7 @@
               <w:spacing w:after="0" w:line="240" w:lineRule="auto"/>
             </w:pPr>
             <w:r>
-              <w:t xml:space="preserve">{{s5_vc1_cond}}</w:t>
+              <w:t xml:space="preserve">{$s5_vc1_cond$}</w:t>
             </w:r>
           </w:p>
         </w:tc>
@@ -11600,7 +11600,7 @@
               <w:spacing w:after="0" w:line="240" w:lineRule="auto"/>
             </w:pPr>
             <w:r>
-              <w:t>9. {{s5_vc2_titulo}}</w:t>
+              <w:t>9. {$s5_vc2_titulo$}</w:t>
             </w:r>
             <w:r>
               <w:t> </w:t>
@@ -11668,7 +11668,7 @@
               <w:spacing w:after="0" w:line="240" w:lineRule="auto"/>
             </w:pPr>
             <w:r>
-              <w:t xml:space="preserve">{{s5_vc2_cond}}</w:t>
+              <w:t xml:space="preserve">{$s5_vc2_cond$}</w:t>
             </w:r>
           </w:p>
         </w:tc>
@@ -11820,7 +11820,7 @@
               <w:spacing w:after="0" w:line="240" w:lineRule="auto"/>
             </w:pPr>
             <w:r>
-              <w:t xml:space="preserve">{{s5_ebc_cond}}/{{s5_ebc_lect}}</w:t>
+              <w:t xml:space="preserve">{$s5_ebc_cond$}/{$s5_ebc_lect$}</w:t>
             </w:r>
           </w:p>
         </w:tc>
@@ -11994,7 +11994,7 @@
               <w:t xml:space="preserve">Canción </w:t>
             </w:r>
             <w:r>
-              <w:t xml:space="preserve">{{s5_can_ci}}</w:t>
+              <w:t xml:space="preserve">{$s5_can_ci$}</w:t>
             </w:r>
           </w:p>
         </w:tc>
@@ -12051,7 +12051,7 @@
               <w:spacing w:after="0" w:line="240" w:lineRule="auto"/>
             </w:pPr>
             <w:r>
-              <w:t xml:space="preserve">{{s5_oracion_ci}}</w:t>
+              <w:t xml:space="preserve">{$s5_oracion_ci$}</w:t>
             </w:r>
           </w:p>
         </w:tc>

</xml_diff>